<commit_message>
updated code, data, results, abstract
</commit_message>
<xml_diff>
--- a/Results/table1.localities.docx
+++ b/Results/table1.localities.docx
@@ -606,7 +606,7 @@
                 <w:szCs w:val="22"/>
                 <w:color w:val="666666"/>
               </w:rPr>
-              <w:t xml:space="preserve">BJE01248</w:t>
+              <w:t xml:space="preserve">BJE01143</w:t>
             </w:r>
           </w:p>
         </w:tc>
@@ -659,7 +659,7 @@
                 <w:szCs w:val="22"/>
                 <w:color w:val="666666"/>
               </w:rPr>
-              <w:t xml:space="preserve">Oreophryne frontifasciata</w:t>
+              <w:t xml:space="preserve">Oreophryne senckenbergiana</w:t>
             </w:r>
           </w:p>
         </w:tc>
@@ -712,7 +712,7 @@
                 <w:szCs w:val="22"/>
                 <w:color w:val="666666"/>
               </w:rPr>
-              <w:t xml:space="preserve">Kabupaten Halmahera Timur,</w:t>
+              <w:t xml:space="preserve">Kabupaten Halmahera Utara,</w:t>
             </w:r>
             <w:r>
               <w:rPr>
@@ -789,7 +789,7 @@
                 <w:szCs w:val="22"/>
                 <w:color w:val="666666"/>
               </w:rPr>
-              <w:t xml:space="preserve">1.3667, 128.2330</w:t>
+              <w:t xml:space="preserve">1.7899, 127.8910</w:t>
             </w:r>
           </w:p>
         </w:tc>
@@ -848,7 +848,7 @@
                 <w:szCs w:val="22"/>
                 <w:color w:val="666666"/>
               </w:rPr>
-              <w:t xml:space="preserve">BJE01143</w:t>
+              <w:t xml:space="preserve">BJE01144</w:t>
             </w:r>
           </w:p>
         </w:tc>
@@ -1041,248 +1041,6 @@
           <w:trHeight w:val="646" w:hRule="auto"/>
         </w:trPr>
         body3
-        <w:tc>
-          <w:tcPr>
-            <w:tcBorders>
-              <w:bottom w:val="none" w:sz="0" w:space="0" w:color="000000"/>
-              <w:top w:val="none" w:sz="0" w:space="0" w:color="000000"/>
-              <w:left w:val="none" w:sz="0" w:space="0" w:color="000000"/>
-              <w:right w:val="none" w:sz="0" w:space="0" w:color="000000"/>
-            </w:tcBorders>
-            <w:shd w:val="clear" w:color="auto" w:fill="FFFFFF"/>
-            <w:tcMar>
-              <w:top w:w="0" w:type="dxa"/>
-              <w:bottom w:w="0" w:type="dxa"/>
-              <w:left w:w="0" w:type="dxa"/>
-              <w:right w:w="0" w:type="dxa"/>
-            </w:tcMar>
-            <w:vAlign w:val="center"/>
-          </w:tcPr>
-          <w:p>
-            <w:pPr>
-              <w:pStyle w:val="Normal"/>
-              <w:jc w:val="left"/>
-              <w:pBdr>
-                <w:bottom w:val="none" w:sz="0" w:space="0" w:color="000000"/>
-                <w:top w:val="none" w:sz="0" w:space="0" w:color="000000"/>
-                <w:left w:val="none" w:sz="0" w:space="0" w:color="000000"/>
-                <w:right w:val="none" w:sz="0" w:space="0" w:color="000000"/>
-              </w:pBdr>
-              <w:spacing w:after="40" w:before="40" w:line="240"/>
-              <w:ind w:left="40" w:right="40" w:firstLine="0" w:firstLineChars="0"/>
-              <w:rPr>
-                <w:rFonts w:ascii="Helvetica" w:hAnsi="Helvetica" w:eastAsia="Helvetica" w:cs="Helvetica"/>
-                <w:i w:val="false"/>
-                <w:b w:val="false"/>
-                <w:u w:val="none"/>
-                <w:sz w:val="22"/>
-                <w:szCs w:val="22"/>
-                <w:color w:val="666666"/>
-              </w:rPr>
-            </w:pPr>
-            <w:r>
-              <w:rPr>
-                <w:rFonts w:ascii="Helvetica" w:hAnsi="Helvetica" w:eastAsia="Helvetica" w:cs="Helvetica"/>
-                <w:i w:val="false"/>
-                <w:b w:val="false"/>
-                <w:u w:val="none"/>
-                <w:sz w:val="22"/>
-                <w:szCs w:val="22"/>
-                <w:color w:val="666666"/>
-              </w:rPr>
-              <w:t xml:space="preserve">BJE01144</w:t>
-            </w:r>
-          </w:p>
-        </w:tc>
-        <w:tc>
-          <w:tcPr>
-            <w:tcBorders>
-              <w:bottom w:val="none" w:sz="0" w:space="0" w:color="000000"/>
-              <w:top w:val="none" w:sz="0" w:space="0" w:color="000000"/>
-              <w:left w:val="none" w:sz="0" w:space="0" w:color="000000"/>
-              <w:right w:val="none" w:sz="0" w:space="0" w:color="000000"/>
-            </w:tcBorders>
-            <w:shd w:val="clear" w:color="auto" w:fill="FFFFFF"/>
-            <w:tcMar>
-              <w:top w:w="0" w:type="dxa"/>
-              <w:bottom w:w="0" w:type="dxa"/>
-              <w:left w:w="0" w:type="dxa"/>
-              <w:right w:w="0" w:type="dxa"/>
-            </w:tcMar>
-            <w:vAlign w:val="center"/>
-          </w:tcPr>
-          <w:p>
-            <w:pPr>
-              <w:pStyle w:val="Normal"/>
-              <w:jc w:val="left"/>
-              <w:pBdr>
-                <w:bottom w:val="none" w:sz="0" w:space="0" w:color="000000"/>
-                <w:top w:val="none" w:sz="0" w:space="0" w:color="000000"/>
-                <w:left w:val="none" w:sz="0" w:space="0" w:color="000000"/>
-                <w:right w:val="none" w:sz="0" w:space="0" w:color="000000"/>
-              </w:pBdr>
-              <w:spacing w:after="40" w:before="40" w:line="240"/>
-              <w:ind w:left="40" w:right="40" w:firstLine="0" w:firstLineChars="0"/>
-              <w:rPr>
-                <w:rFonts w:ascii="Helvetica" w:hAnsi="Helvetica" w:eastAsia="Helvetica" w:cs="Helvetica"/>
-                <w:i w:val="true"/>
-                <w:b w:val="false"/>
-                <w:u w:val="none"/>
-                <w:sz w:val="22"/>
-                <w:szCs w:val="22"/>
-                <w:color w:val="666666"/>
-              </w:rPr>
-            </w:pPr>
-            <w:r>
-              <w:rPr>
-                <w:rFonts w:ascii="Helvetica" w:hAnsi="Helvetica" w:eastAsia="Helvetica" w:cs="Helvetica"/>
-                <w:i w:val="true"/>
-                <w:b w:val="false"/>
-                <w:u w:val="none"/>
-                <w:sz w:val="22"/>
-                <w:szCs w:val="22"/>
-                <w:color w:val="666666"/>
-              </w:rPr>
-              <w:t xml:space="preserve">Oreophryne senckenbergiana</w:t>
-            </w:r>
-          </w:p>
-        </w:tc>
-        <w:tc>
-          <w:tcPr>
-            <w:tcBorders>
-              <w:bottom w:val="none" w:sz="0" w:space="0" w:color="000000"/>
-              <w:top w:val="none" w:sz="0" w:space="0" w:color="000000"/>
-              <w:left w:val="none" w:sz="0" w:space="0" w:color="000000"/>
-              <w:right w:val="none" w:sz="0" w:space="0" w:color="000000"/>
-            </w:tcBorders>
-            <w:shd w:val="clear" w:color="auto" w:fill="FFFFFF"/>
-            <w:tcMar>
-              <w:top w:w="0" w:type="dxa"/>
-              <w:bottom w:w="0" w:type="dxa"/>
-              <w:left w:w="0" w:type="dxa"/>
-              <w:right w:w="0" w:type="dxa"/>
-            </w:tcMar>
-            <w:vAlign w:val="center"/>
-          </w:tcPr>
-          <w:p>
-            <w:pPr>
-              <w:pStyle w:val="Normal"/>
-              <w:jc w:val="left"/>
-              <w:pBdr>
-                <w:bottom w:val="none" w:sz="0" w:space="0" w:color="000000"/>
-                <w:top w:val="none" w:sz="0" w:space="0" w:color="000000"/>
-                <w:left w:val="none" w:sz="0" w:space="0" w:color="000000"/>
-                <w:right w:val="none" w:sz="0" w:space="0" w:color="000000"/>
-              </w:pBdr>
-              <w:spacing w:after="40" w:before="40" w:line="240"/>
-              <w:ind w:left="40" w:right="40" w:firstLine="0" w:firstLineChars="0"/>
-              <w:rPr>
-                <w:rFonts w:ascii="Helvetica" w:hAnsi="Helvetica" w:eastAsia="Helvetica" w:cs="Helvetica"/>
-                <w:i w:val="false"/>
-                <w:b w:val="false"/>
-                <w:u w:val="none"/>
-                <w:sz w:val="22"/>
-                <w:szCs w:val="22"/>
-                <w:color w:val="666666"/>
-              </w:rPr>
-            </w:pPr>
-            <w:r>
-              <w:rPr>
-                <w:rFonts w:ascii="Helvetica" w:hAnsi="Helvetica" w:eastAsia="Helvetica" w:cs="Helvetica"/>
-                <w:i w:val="false"/>
-                <w:b w:val="false"/>
-                <w:u w:val="none"/>
-                <w:sz w:val="22"/>
-                <w:szCs w:val="22"/>
-                <w:color w:val="666666"/>
-              </w:rPr>
-              <w:t xml:space="preserve">Kabupaten Halmahera Utara,</w:t>
-            </w:r>
-            <w:r>
-              <w:rPr>
-                <w:rFonts w:ascii="Helvetica" w:hAnsi="Helvetica" w:eastAsia="Helvetica" w:cs="Helvetica"/>
-                <w:i w:val="false"/>
-                <w:b w:val="false"/>
-                <w:u w:val="none"/>
-                <w:sz w:val="22"/>
-                <w:szCs w:val="22"/>
-                <w:color w:val="666666"/>
-              </w:rPr>
-              <w:br/>
-            </w:r>
-            <w:r>
-              <w:rPr>
-                <w:rFonts w:ascii="Helvetica" w:hAnsi="Helvetica" w:eastAsia="Helvetica" w:cs="Helvetica"/>
-                <w:i w:val="false"/>
-                <w:b w:val="false"/>
-                <w:u w:val="none"/>
-                <w:sz w:val="22"/>
-                <w:szCs w:val="22"/>
-                <w:color w:val="666666"/>
-              </w:rPr>
-              <w:t xml:space="preserve">Halmahera Island, North Maluku</w:t>
-            </w:r>
-          </w:p>
-        </w:tc>
-        <w:tc>
-          <w:tcPr>
-            <w:tcBorders>
-              <w:bottom w:val="none" w:sz="0" w:space="0" w:color="000000"/>
-              <w:top w:val="none" w:sz="0" w:space="0" w:color="000000"/>
-              <w:left w:val="none" w:sz="0" w:space="0" w:color="000000"/>
-              <w:right w:val="none" w:sz="0" w:space="0" w:color="000000"/>
-            </w:tcBorders>
-            <w:shd w:val="clear" w:color="auto" w:fill="FFFFFF"/>
-            <w:tcMar>
-              <w:top w:w="0" w:type="dxa"/>
-              <w:bottom w:w="0" w:type="dxa"/>
-              <w:left w:w="0" w:type="dxa"/>
-              <w:right w:w="0" w:type="dxa"/>
-            </w:tcMar>
-            <w:vAlign w:val="center"/>
-          </w:tcPr>
-          <w:p>
-            <w:pPr>
-              <w:pStyle w:val="Normal"/>
-              <w:jc w:val="left"/>
-              <w:pBdr>
-                <w:bottom w:val="none" w:sz="0" w:space="0" w:color="000000"/>
-                <w:top w:val="none" w:sz="0" w:space="0" w:color="000000"/>
-                <w:left w:val="none" w:sz="0" w:space="0" w:color="000000"/>
-                <w:right w:val="none" w:sz="0" w:space="0" w:color="000000"/>
-              </w:pBdr>
-              <w:spacing w:after="40" w:before="40" w:line="240"/>
-              <w:ind w:left="40" w:right="40" w:firstLine="0" w:firstLineChars="0"/>
-              <w:rPr>
-                <w:rFonts w:ascii="Helvetica" w:hAnsi="Helvetica" w:eastAsia="Helvetica" w:cs="Helvetica"/>
-                <w:i w:val="false"/>
-                <w:b w:val="false"/>
-                <w:u w:val="none"/>
-                <w:sz w:val="22"/>
-                <w:szCs w:val="22"/>
-                <w:color w:val="666666"/>
-              </w:rPr>
-            </w:pPr>
-            <w:r>
-              <w:rPr>
-                <w:rFonts w:ascii="Helvetica" w:hAnsi="Helvetica" w:eastAsia="Helvetica" w:cs="Helvetica"/>
-                <w:i w:val="false"/>
-                <w:b w:val="false"/>
-                <w:u w:val="none"/>
-                <w:sz w:val="22"/>
-                <w:szCs w:val="22"/>
-                <w:color w:val="666666"/>
-              </w:rPr>
-              <w:t xml:space="preserve">1.7899, 127.8910</w:t>
-            </w:r>
-          </w:p>
-        </w:tc>
-      </w:tr>
-      <w:tr>
-        <w:trPr>
-          <w:trHeight w:val="646" w:hRule="auto"/>
-        </w:trPr>
-        body4
         <w:tc>
           <w:tcPr>
             <w:tcBorders>

</xml_diff>

<commit_message>
updated more corrections and response to reviewers
</commit_message>
<xml_diff>
--- a/Results/table1.localities.docx
+++ b/Results/table1.localities.docx
@@ -24,10 +24,9 @@
       </w:tblGrid>
       <w:tr>
         <w:trPr>
-          <w:trHeight w:val="459" w:hRule="auto"/>
+          <w:trHeight w:val="518" w:hRule="auto"/>
           <w:tblHeader/>
         </w:trPr>
-        header1
         <w:tc>
           <w:tcPr>
             <w:gridSpan w:val="4"/>
@@ -63,6 +62,7 @@
                 <w:i w:val="false"/>
                 <w:b w:val="true"/>
                 <w:u w:val="none"/>
+                <w:strike w:val="false"/>
                 <w:sz w:val="22"/>
                 <w:szCs w:val="22"/>
                 <w:color w:val="666666"/>
@@ -74,6 +74,7 @@
                 <w:i w:val="false"/>
                 <w:b w:val="true"/>
                 <w:u w:val="none"/>
+                <w:strike w:val="false"/>
                 <w:sz w:val="22"/>
                 <w:szCs w:val="22"/>
                 <w:color w:val="666666"/>
@@ -85,10 +86,9 @@
       </w:tr>
       <w:tr>
         <w:trPr>
-          <w:trHeight w:val="459" w:hRule="auto"/>
+          <w:trHeight w:val="518" w:hRule="auto"/>
           <w:tblHeader/>
         </w:trPr>
-        header2
         <w:tc>
           <w:tcPr>
             <w:gridSpan w:val="4"/>
@@ -124,6 +124,7 @@
                 <w:i w:val="false"/>
                 <w:b w:val="false"/>
                 <w:u w:val="none"/>
+                <w:strike w:val="false"/>
                 <w:sz w:val="22"/>
                 <w:szCs w:val="22"/>
                 <w:color w:val="666666"/>
@@ -135,6 +136,7 @@
                 <w:i w:val="false"/>
                 <w:b w:val="false"/>
                 <w:u w:val="none"/>
+                <w:strike w:val="false"/>
                 <w:sz w:val="22"/>
                 <w:szCs w:val="22"/>
                 <w:color w:val="666666"/>
@@ -146,10 +148,9 @@
       </w:tr>
       <w:tr>
         <w:trPr>
-          <w:trHeight w:val="459" w:hRule="auto"/>
+          <w:trHeight w:val="518" w:hRule="auto"/>
           <w:tblHeader/>
         </w:trPr>
-        header3
         <w:tc>
           <w:tcPr>
             <w:vMerge w:val="restart"/>
@@ -185,6 +186,7 @@
                 <w:i w:val="false"/>
                 <w:b w:val="false"/>
                 <w:u w:val="none"/>
+                <w:strike w:val="false"/>
                 <w:sz w:val="22"/>
                 <w:szCs w:val="22"/>
                 <w:color w:val="666666"/>
@@ -196,6 +198,7 @@
                 <w:i w:val="false"/>
                 <w:b w:val="false"/>
                 <w:u w:val="none"/>
+                <w:strike w:val="false"/>
                 <w:sz w:val="22"/>
                 <w:szCs w:val="22"/>
                 <w:color w:val="666666"/>
@@ -239,6 +242,7 @@
                 <w:i w:val="false"/>
                 <w:b w:val="false"/>
                 <w:u w:val="none"/>
+                <w:strike w:val="false"/>
                 <w:sz w:val="22"/>
                 <w:szCs w:val="22"/>
                 <w:color w:val="666666"/>
@@ -250,6 +254,7 @@
                 <w:i w:val="false"/>
                 <w:b w:val="false"/>
                 <w:u w:val="none"/>
+                <w:strike w:val="false"/>
                 <w:sz w:val="22"/>
                 <w:szCs w:val="22"/>
                 <w:color w:val="666666"/>
@@ -293,6 +298,7 @@
                 <w:i w:val="false"/>
                 <w:b w:val="false"/>
                 <w:u w:val="none"/>
+                <w:strike w:val="false"/>
                 <w:sz w:val="22"/>
                 <w:szCs w:val="22"/>
                 <w:color w:val="666666"/>
@@ -304,6 +310,7 @@
                 <w:i w:val="false"/>
                 <w:b w:val="false"/>
                 <w:u w:val="none"/>
+                <w:strike w:val="false"/>
                 <w:sz w:val="22"/>
                 <w:szCs w:val="22"/>
                 <w:color w:val="666666"/>
@@ -346,6 +353,7 @@
                 <w:i w:val="false"/>
                 <w:b w:val="false"/>
                 <w:u w:val="none"/>
+                <w:strike w:val="false"/>
                 <w:sz w:val="22"/>
                 <w:szCs w:val="22"/>
                 <w:color w:val="666666"/>
@@ -357,6 +365,7 @@
                 <w:i w:val="false"/>
                 <w:b w:val="false"/>
                 <w:u w:val="none"/>
+                <w:strike w:val="false"/>
                 <w:sz w:val="22"/>
                 <w:szCs w:val="22"/>
                 <w:color w:val="666666"/>
@@ -368,10 +377,9 @@
       </w:tr>
       <w:tr>
         <w:trPr>
-          <w:trHeight w:val="458" w:hRule="auto"/>
+          <w:trHeight w:val="503" w:hRule="auto"/>
           <w:tblHeader/>
         </w:trPr>
-        header4
         <w:tc>
           <w:tcPr>
             <w:vMerge/>
@@ -407,6 +415,7 @@
                 <w:i w:val="false"/>
                 <w:b w:val="false"/>
                 <w:u w:val="none"/>
+                <w:strike w:val="false"/>
                 <w:sz w:val="22"/>
                 <w:szCs w:val="22"/>
                 <w:color w:val="666666"/>
@@ -449,6 +458,7 @@
                 <w:i w:val="false"/>
                 <w:b w:val="false"/>
                 <w:u w:val="none"/>
+                <w:strike w:val="false"/>
                 <w:sz w:val="22"/>
                 <w:szCs w:val="22"/>
                 <w:color w:val="666666"/>
@@ -491,6 +501,7 @@
                 <w:i w:val="false"/>
                 <w:b w:val="false"/>
                 <w:u w:val="none"/>
+                <w:strike w:val="false"/>
                 <w:sz w:val="22"/>
                 <w:szCs w:val="22"/>
                 <w:color w:val="666666"/>
@@ -532,6 +543,7 @@
                 <w:i w:val="false"/>
                 <w:b w:val="false"/>
                 <w:u w:val="none"/>
+                <w:strike w:val="false"/>
                 <w:sz w:val="22"/>
                 <w:szCs w:val="22"/>
                 <w:color w:val="666666"/>
@@ -543,6 +555,7 @@
                 <w:i w:val="false"/>
                 <w:b w:val="false"/>
                 <w:u w:val="none"/>
+                <w:strike w:val="false"/>
                 <w:sz w:val="22"/>
                 <w:szCs w:val="22"/>
                 <w:color w:val="666666"/>
@@ -554,9 +567,8 @@
       </w:tr>
       <w:tr>
         <w:trPr>
-          <w:trHeight w:val="646" w:hRule="auto"/>
+          <w:trHeight w:val="752" w:hRule="auto"/>
         </w:trPr>
-        body1
         <w:tc>
           <w:tcPr>
             <w:tcBorders>
@@ -591,6 +603,7 @@
                 <w:i w:val="false"/>
                 <w:b w:val="false"/>
                 <w:u w:val="none"/>
+                <w:strike w:val="false"/>
                 <w:sz w:val="22"/>
                 <w:szCs w:val="22"/>
                 <w:color w:val="666666"/>
@@ -602,6 +615,7 @@
                 <w:i w:val="false"/>
                 <w:b w:val="false"/>
                 <w:u w:val="none"/>
+                <w:strike w:val="false"/>
                 <w:sz w:val="22"/>
                 <w:szCs w:val="22"/>
                 <w:color w:val="666666"/>
@@ -644,6 +658,7 @@
                 <w:i w:val="true"/>
                 <w:b w:val="false"/>
                 <w:u w:val="none"/>
+                <w:strike w:val="false"/>
                 <w:sz w:val="22"/>
                 <w:szCs w:val="22"/>
                 <w:color w:val="666666"/>
@@ -655,11 +670,12 @@
                 <w:i w:val="true"/>
                 <w:b w:val="false"/>
                 <w:u w:val="none"/>
-                <w:sz w:val="22"/>
-                <w:szCs w:val="22"/>
-                <w:color w:val="666666"/>
-              </w:rPr>
-              <w:t xml:space="preserve">Oreophryne senckenbergiana</w:t>
+                <w:strike w:val="false"/>
+                <w:sz w:val="22"/>
+                <w:szCs w:val="22"/>
+                <w:color w:val="666666"/>
+              </w:rPr>
+              <w:t xml:space="preserve">Oreophryne moluccensis</w:t>
             </w:r>
           </w:p>
         </w:tc>
@@ -697,6 +713,7 @@
                 <w:i w:val="false"/>
                 <w:b w:val="false"/>
                 <w:u w:val="none"/>
+                <w:strike w:val="false"/>
                 <w:sz w:val="22"/>
                 <w:szCs w:val="22"/>
                 <w:color w:val="666666"/>
@@ -708,6 +725,7 @@
                 <w:i w:val="false"/>
                 <w:b w:val="false"/>
                 <w:u w:val="none"/>
+                <w:strike w:val="false"/>
                 <w:sz w:val="22"/>
                 <w:szCs w:val="22"/>
                 <w:color w:val="666666"/>
@@ -720,6 +738,7 @@
                 <w:i w:val="false"/>
                 <w:b w:val="false"/>
                 <w:u w:val="none"/>
+                <w:strike w:val="false"/>
                 <w:sz w:val="22"/>
                 <w:szCs w:val="22"/>
                 <w:color w:val="666666"/>
@@ -732,6 +751,7 @@
                 <w:i w:val="false"/>
                 <w:b w:val="false"/>
                 <w:u w:val="none"/>
+                <w:strike w:val="false"/>
                 <w:sz w:val="22"/>
                 <w:szCs w:val="22"/>
                 <w:color w:val="666666"/>
@@ -774,6 +794,7 @@
                 <w:i w:val="false"/>
                 <w:b w:val="false"/>
                 <w:u w:val="none"/>
+                <w:strike w:val="false"/>
                 <w:sz w:val="22"/>
                 <w:szCs w:val="22"/>
                 <w:color w:val="666666"/>
@@ -785,6 +806,7 @@
                 <w:i w:val="false"/>
                 <w:b w:val="false"/>
                 <w:u w:val="none"/>
+                <w:strike w:val="false"/>
                 <w:sz w:val="22"/>
                 <w:szCs w:val="22"/>
                 <w:color w:val="666666"/>
@@ -796,9 +818,8 @@
       </w:tr>
       <w:tr>
         <w:trPr>
-          <w:trHeight w:val="646" w:hRule="auto"/>
+          <w:trHeight w:val="752" w:hRule="auto"/>
         </w:trPr>
-        body2
         <w:tc>
           <w:tcPr>
             <w:tcBorders>
@@ -833,6 +854,7 @@
                 <w:i w:val="false"/>
                 <w:b w:val="false"/>
                 <w:u w:val="none"/>
+                <w:strike w:val="false"/>
                 <w:sz w:val="22"/>
                 <w:szCs w:val="22"/>
                 <w:color w:val="666666"/>
@@ -844,6 +866,7 @@
                 <w:i w:val="false"/>
                 <w:b w:val="false"/>
                 <w:u w:val="none"/>
+                <w:strike w:val="false"/>
                 <w:sz w:val="22"/>
                 <w:szCs w:val="22"/>
                 <w:color w:val="666666"/>
@@ -886,6 +909,7 @@
                 <w:i w:val="true"/>
                 <w:b w:val="false"/>
                 <w:u w:val="none"/>
+                <w:strike w:val="false"/>
                 <w:sz w:val="22"/>
                 <w:szCs w:val="22"/>
                 <w:color w:val="666666"/>
@@ -897,11 +921,12 @@
                 <w:i w:val="true"/>
                 <w:b w:val="false"/>
                 <w:u w:val="none"/>
-                <w:sz w:val="22"/>
-                <w:szCs w:val="22"/>
-                <w:color w:val="666666"/>
-              </w:rPr>
-              <w:t xml:space="preserve">Oreophryne senckenbergiana</w:t>
+                <w:strike w:val="false"/>
+                <w:sz w:val="22"/>
+                <w:szCs w:val="22"/>
+                <w:color w:val="666666"/>
+              </w:rPr>
+              <w:t xml:space="preserve">Oreophryne moluccensis</w:t>
             </w:r>
           </w:p>
         </w:tc>
@@ -939,6 +964,7 @@
                 <w:i w:val="false"/>
                 <w:b w:val="false"/>
                 <w:u w:val="none"/>
+                <w:strike w:val="false"/>
                 <w:sz w:val="22"/>
                 <w:szCs w:val="22"/>
                 <w:color w:val="666666"/>
@@ -950,6 +976,7 @@
                 <w:i w:val="false"/>
                 <w:b w:val="false"/>
                 <w:u w:val="none"/>
+                <w:strike w:val="false"/>
                 <w:sz w:val="22"/>
                 <w:szCs w:val="22"/>
                 <w:color w:val="666666"/>
@@ -962,6 +989,7 @@
                 <w:i w:val="false"/>
                 <w:b w:val="false"/>
                 <w:u w:val="none"/>
+                <w:strike w:val="false"/>
                 <w:sz w:val="22"/>
                 <w:szCs w:val="22"/>
                 <w:color w:val="666666"/>
@@ -974,6 +1002,7 @@
                 <w:i w:val="false"/>
                 <w:b w:val="false"/>
                 <w:u w:val="none"/>
+                <w:strike w:val="false"/>
                 <w:sz w:val="22"/>
                 <w:szCs w:val="22"/>
                 <w:color w:val="666666"/>
@@ -1016,6 +1045,7 @@
                 <w:i w:val="false"/>
                 <w:b w:val="false"/>
                 <w:u w:val="none"/>
+                <w:strike w:val="false"/>
                 <w:sz w:val="22"/>
                 <w:szCs w:val="22"/>
                 <w:color w:val="666666"/>
@@ -1027,6 +1057,7 @@
                 <w:i w:val="false"/>
                 <w:b w:val="false"/>
                 <w:u w:val="none"/>
+                <w:strike w:val="false"/>
                 <w:sz w:val="22"/>
                 <w:szCs w:val="22"/>
                 <w:color w:val="666666"/>
@@ -1038,9 +1069,8 @@
       </w:tr>
       <w:tr>
         <w:trPr>
-          <w:trHeight w:val="646" w:hRule="auto"/>
+          <w:trHeight w:val="767" w:hRule="auto"/>
         </w:trPr>
-        body3
         <w:tc>
           <w:tcPr>
             <w:tcBorders>
@@ -1075,6 +1105,7 @@
                 <w:i w:val="false"/>
                 <w:b w:val="false"/>
                 <w:u w:val="none"/>
+                <w:strike w:val="false"/>
                 <w:sz w:val="22"/>
                 <w:szCs w:val="22"/>
                 <w:color w:val="666666"/>
@@ -1086,6 +1117,7 @@
                 <w:i w:val="false"/>
                 <w:b w:val="false"/>
                 <w:u w:val="none"/>
+                <w:strike w:val="false"/>
                 <w:sz w:val="22"/>
                 <w:szCs w:val="22"/>
                 <w:color w:val="666666"/>
@@ -1128,6 +1160,7 @@
                 <w:i w:val="true"/>
                 <w:b w:val="false"/>
                 <w:u w:val="none"/>
+                <w:strike w:val="false"/>
                 <w:sz w:val="22"/>
                 <w:szCs w:val="22"/>
                 <w:color w:val="666666"/>
@@ -1139,11 +1172,12 @@
                 <w:i w:val="true"/>
                 <w:b w:val="false"/>
                 <w:u w:val="none"/>
-                <w:sz w:val="22"/>
-                <w:szCs w:val="22"/>
-                <w:color w:val="666666"/>
-              </w:rPr>
-              <w:t xml:space="preserve">Oreophryne senckenbergiana</w:t>
+                <w:strike w:val="false"/>
+                <w:sz w:val="22"/>
+                <w:szCs w:val="22"/>
+                <w:color w:val="666666"/>
+              </w:rPr>
+              <w:t xml:space="preserve">Oreophryne moluccensis</w:t>
             </w:r>
           </w:p>
         </w:tc>
@@ -1181,6 +1215,7 @@
                 <w:i w:val="false"/>
                 <w:b w:val="false"/>
                 <w:u w:val="none"/>
+                <w:strike w:val="false"/>
                 <w:sz w:val="22"/>
                 <w:szCs w:val="22"/>
                 <w:color w:val="666666"/>
@@ -1192,6 +1227,7 @@
                 <w:i w:val="false"/>
                 <w:b w:val="false"/>
                 <w:u w:val="none"/>
+                <w:strike w:val="false"/>
                 <w:sz w:val="22"/>
                 <w:szCs w:val="22"/>
                 <w:color w:val="666666"/>
@@ -1204,6 +1240,7 @@
                 <w:i w:val="false"/>
                 <w:b w:val="false"/>
                 <w:u w:val="none"/>
+                <w:strike w:val="false"/>
                 <w:sz w:val="22"/>
                 <w:szCs w:val="22"/>
                 <w:color w:val="666666"/>
@@ -1216,6 +1253,7 @@
                 <w:i w:val="false"/>
                 <w:b w:val="false"/>
                 <w:u w:val="none"/>
+                <w:strike w:val="false"/>
                 <w:sz w:val="22"/>
                 <w:szCs w:val="22"/>
                 <w:color w:val="666666"/>
@@ -1258,6 +1296,7 @@
                 <w:i w:val="false"/>
                 <w:b w:val="false"/>
                 <w:u w:val="none"/>
+                <w:strike w:val="false"/>
                 <w:sz w:val="22"/>
                 <w:szCs w:val="22"/>
                 <w:color w:val="666666"/>
@@ -1269,6 +1308,7 @@
                 <w:i w:val="false"/>
                 <w:b w:val="false"/>
                 <w:u w:val="none"/>
+                <w:strike w:val="false"/>
                 <w:sz w:val="22"/>
                 <w:szCs w:val="22"/>
                 <w:color w:val="666666"/>

</xml_diff>